<commit_message>
Enhance footer phone components with new apps and features. Removed Luxian references, added Clip Lab, and improved UI elements across various screens.
</commit_message>
<xml_diff>
--- a/resume/final-resume.docx
+++ b/resume/final-resume.docx
@@ -111,15 +111,13 @@
         <w:t xml:space="preserve">  ·  </w:t>
       </w:r>
       <w:hyperlink r:id="rId8" w:history="1">
-        <w:proofErr w:type="spellStart"/>
         <w:r>
           <w:rPr>
             <w:color w:val="2563EB"/>
             <w:u w:val="single" w:color="2563EB"/>
           </w:rPr>
-          <w:t>ashraf-swaidan.pages.dev</w:t>
+          <w:t>https://ashraf-swaidan.github.io/ashraf-swaidan/</w:t>
         </w:r>
-        <w:proofErr w:type="spellEnd"/>
       </w:hyperlink>
     </w:p>
     <w:p>
@@ -166,10 +164,7 @@
     </w:p>
     <w:p>
       <w:r>
-        <w:t>Software developer and Computer Science graduate who builds web apps and sys</w:t>
-      </w:r>
-      <w:r>
-        <w:t>tems for real business operations. Production-style platforms that turn messy workflo</w:t>
+        <w:t>Software developer and Computer Science graduate who builds web apps and systems for real business operations. Production-style platforms that turn messy workflo</w:t>
       </w:r>
       <w:r>
         <w:t>ws into clear, usable products,</w:t>
@@ -231,17 +226,7 @@
           <w:sz w:val="20"/>
           <w:szCs w:val="20"/>
         </w:rPr>
-        <w:t xml:space="preserve"> System — Bu</w:t>
-      </w:r>
-      <w:r>
-        <w:rPr>
-          <w:b/>
-          <w:bCs/>
-          <w:color w:val="1F2937"/>
-          <w:sz w:val="20"/>
-          <w:szCs w:val="20"/>
-        </w:rPr>
-        <w:t>siness Operations Platform</w:t>
+        <w:t xml:space="preserve"> System — Business Operations Platform</w:t>
       </w:r>
     </w:p>
     <w:p>
@@ -257,37 +242,12 @@
         <w:t xml:space="preserve">Case study: </w:t>
       </w:r>
       <w:hyperlink r:id="rId9" w:history="1">
-        <w:proofErr w:type="spellStart"/>
         <w:r>
           <w:rPr>
             <w:color w:val="2563EB"/>
             <w:u w:val="single" w:color="2563EB"/>
           </w:rPr>
-          <w:t>ashraf-swaidan.pages.dev</w:t>
-        </w:r>
-        <w:proofErr w:type="spellEnd"/>
-        <w:r>
-          <w:rPr>
-            <w:color w:val="2563EB"/>
-            <w:u w:val="single" w:color="2563EB"/>
-          </w:rPr>
-          <w:t>/works/</w:t>
-        </w:r>
-        <w:proofErr w:type="spellStart"/>
-        <w:r>
-          <w:rPr>
-            <w:color w:val="2563EB"/>
-            <w:u w:val="single" w:color="2563EB"/>
-          </w:rPr>
-          <w:t>papion</w:t>
-        </w:r>
-        <w:proofErr w:type="spellEnd"/>
-        <w:r>
-          <w:rPr>
-            <w:color w:val="2563EB"/>
-            <w:u w:val="single" w:color="2563EB"/>
-          </w:rPr>
-          <w:t>-system</w:t>
+          <w:t>https://ashraf-swaidan.github.io/ashraf-swaidan/works/papion-system</w:t>
         </w:r>
       </w:hyperlink>
     </w:p>
@@ -327,10 +287,7 @@
         <w:spacing w:before="40" w:after="40"/>
       </w:pPr>
       <w:r>
-        <w:t>Designed workflows around real daily pressure: mixed-inventory orders, partial payments, unpaid follow-up, dra</w:t>
-      </w:r>
-      <w:r>
-        <w:t>fts, barcode use, branch-aware insights, supplier-linked stock, and wallet-based finance.</w:t>
+        <w:t>Designed workflows around real daily pressure: mixed-inventory orders, partial payments, unpaid follow-up, drafts, barcode use, branch-aware insights, supplier-linked stock, and wallet-based finance.</w:t>
       </w:r>
     </w:p>
     <w:p>
@@ -373,31 +330,13 @@
         <w:t xml:space="preserve">Case study: </w:t>
       </w:r>
       <w:hyperlink r:id="rId10" w:history="1">
-        <w:proofErr w:type="spellStart"/>
         <w:r>
           <w:rPr>
             <w:color w:val="2563EB"/>
             <w:u w:val="single" w:color="2563EB"/>
           </w:rPr>
-          <w:t>ashraf-swaidan.pages.dev</w:t>
+          <w:t>https://ashraf-swaidan.github.io/ashraf-swaidan/works/luxian</w:t>
         </w:r>
-        <w:proofErr w:type="spellEnd"/>
-        <w:r>
-          <w:rPr>
-            <w:color w:val="2563EB"/>
-            <w:u w:val="single" w:color="2563EB"/>
-          </w:rPr>
-          <w:t>/works/</w:t>
-        </w:r>
-        <w:proofErr w:type="spellStart"/>
-        <w:r>
-          <w:rPr>
-            <w:color w:val="2563EB"/>
-            <w:u w:val="single" w:color="2563EB"/>
-          </w:rPr>
-          <w:t>luxian</w:t>
-        </w:r>
-        <w:proofErr w:type="spellEnd"/>
       </w:hyperlink>
       <w:r>
         <w:rPr>
@@ -450,10 +389,7 @@
         <w:spacing w:before="40" w:after="40"/>
       </w:pPr>
       <w:r>
-        <w:t>Built operato</w:t>
-      </w:r>
-      <w:r>
-        <w:t>r tooling beyond CRUD: homepage CMS with preview-before-publish, Shopify-style collections, profit-aware admin insights, and a supplier order pipeline that restocks SKUs and updates cost on receipt.</w:t>
+        <w:t>Built operator tooling beyond CRUD: homepage CMS with preview-before-publish, Shopify-style collections, profit-aware admin insights, and a supplier order pipeline that restocks SKUs and updates cost on receipt.</w:t>
       </w:r>
     </w:p>
     <w:p>
@@ -503,10 +439,7 @@
         <w:spacing w:before="40" w:after="40"/>
       </w:pPr>
       <w:r>
-        <w:t>Implemented transactional checkout so order creation, line items, stub payment, and inventory</w:t>
-      </w:r>
-      <w:r>
-        <w:t xml:space="preserve"> decrements run in a single database transaction, with a stock movement ledger.</w:t>
+        <w:t>Implemented transactional checkout so order creation, line items, stub payment, and inventory decrements run in a single database transaction, with a stock movement ledger.</w:t>
       </w:r>
     </w:p>
     <w:p>
@@ -549,37 +482,12 @@
         <w:t xml:space="preserve">Case study: </w:t>
       </w:r>
       <w:hyperlink r:id="rId12" w:history="1">
-        <w:proofErr w:type="spellStart"/>
         <w:r>
           <w:rPr>
             <w:color w:val="2563EB"/>
             <w:u w:val="single" w:color="2563EB"/>
           </w:rPr>
-          <w:t>ashraf-swaidan.pages.dev</w:t>
-        </w:r>
-        <w:proofErr w:type="spellEnd"/>
-        <w:r>
-          <w:rPr>
-            <w:color w:val="2563EB"/>
-            <w:u w:val="single" w:color="2563EB"/>
-          </w:rPr>
-          <w:t>/works/</w:t>
-        </w:r>
-        <w:proofErr w:type="spellStart"/>
-        <w:r>
-          <w:rPr>
-            <w:color w:val="2563EB"/>
-            <w:u w:val="single" w:color="2563EB"/>
-          </w:rPr>
-          <w:t>ak</w:t>
-        </w:r>
-        <w:proofErr w:type="spellEnd"/>
-        <w:r>
-          <w:rPr>
-            <w:color w:val="2563EB"/>
-            <w:u w:val="single" w:color="2563EB"/>
-          </w:rPr>
-          <w:t>-system</w:t>
+          <w:t>https://ashraf-swaidan.github.io/ashraf-swaidan/works/ak-system</w:t>
         </w:r>
       </w:hyperlink>
     </w:p>
@@ -593,10 +501,7 @@
         <w:spacing w:before="40" w:after="40"/>
       </w:pPr>
       <w:r>
-        <w:t>Built a local-fir</w:t>
-      </w:r>
-      <w:r>
-        <w:t>st desktop system for a TV/electronics retail workflow.</w:t>
+        <w:t>Built a local-first desktop system for a TV/electronics retail workflow.</w:t>
       </w:r>
     </w:p>
     <w:p>
@@ -636,17 +541,7 @@
           <w:sz w:val="20"/>
           <w:szCs w:val="20"/>
         </w:rPr>
-        <w:t xml:space="preserve"> — AI Goal Execution Plat</w:t>
-      </w:r>
-      <w:r>
-        <w:rPr>
-          <w:b/>
-          <w:bCs/>
-          <w:color w:val="1F2937"/>
-          <w:sz w:val="20"/>
-          <w:szCs w:val="20"/>
-        </w:rPr>
-        <w:t>form</w:t>
+        <w:t xml:space="preserve"> — AI Goal Execution Platform</w:t>
       </w:r>
     </w:p>
     <w:p>
@@ -662,31 +557,13 @@
         <w:t xml:space="preserve">Case study: </w:t>
       </w:r>
       <w:hyperlink r:id="rId13" w:history="1">
-        <w:proofErr w:type="spellStart"/>
         <w:r>
           <w:rPr>
             <w:color w:val="2563EB"/>
             <w:u w:val="single" w:color="2563EB"/>
           </w:rPr>
-          <w:t>ashraf-swaidan.pages.dev</w:t>
+          <w:t>https://ashraf-swaidan.github.io/ashraf-swaidan/works/duwit</w:t>
         </w:r>
-        <w:proofErr w:type="spellEnd"/>
-        <w:r>
-          <w:rPr>
-            <w:color w:val="2563EB"/>
-            <w:u w:val="single" w:color="2563EB"/>
-          </w:rPr>
-          <w:t>/works/</w:t>
-        </w:r>
-        <w:proofErr w:type="spellStart"/>
-        <w:r>
-          <w:rPr>
-            <w:color w:val="2563EB"/>
-            <w:u w:val="single" w:color="2563EB"/>
-          </w:rPr>
-          <w:t>duwit</w:t>
-        </w:r>
-        <w:proofErr w:type="spellEnd"/>
       </w:hyperlink>
       <w:r>
         <w:rPr>
@@ -716,10 +593,7 @@
         <w:spacing w:before="40" w:after="40"/>
       </w:pPr>
       <w:r>
-        <w:t>Built an AI execution product that turns vague goals into phased pla</w:t>
-      </w:r>
-      <w:r>
-        <w:t>ns, task-level coaching, quizzes, and progress memory.</w:t>
+        <w:t>Built an AI execution product that turns vague goals into phased plans, task-level coaching, quizzes, and progress memory.</w:t>
       </w:r>
     </w:p>
     <w:p>
@@ -775,31 +649,13 @@
         <w:t xml:space="preserve">Case study: </w:t>
       </w:r>
       <w:hyperlink r:id="rId15" w:history="1">
-        <w:proofErr w:type="spellStart"/>
         <w:r>
           <w:rPr>
             <w:color w:val="2563EB"/>
             <w:u w:val="single" w:color="2563EB"/>
           </w:rPr>
-          <w:t>ashraf-swaidan.pages.dev</w:t>
+          <w:t>https://ashraf-swaidan.github.io/ashraf-swaidan/works/twodo</w:t>
         </w:r>
-        <w:proofErr w:type="spellEnd"/>
-        <w:r>
-          <w:rPr>
-            <w:color w:val="2563EB"/>
-            <w:u w:val="single" w:color="2563EB"/>
-          </w:rPr>
-          <w:t>/works/</w:t>
-        </w:r>
-        <w:proofErr w:type="spellStart"/>
-        <w:r>
-          <w:rPr>
-            <w:color w:val="2563EB"/>
-            <w:u w:val="single" w:color="2563EB"/>
-          </w:rPr>
-          <w:t>twodo</w:t>
-        </w:r>
-        <w:proofErr w:type="spellEnd"/>
       </w:hyperlink>
       <w:r>
         <w:rPr>
@@ -829,10 +685,7 @@
         <w:spacing w:before="40" w:after="40"/>
       </w:pPr>
       <w:r>
-        <w:t>Built a low-friction task app around fast capture, simp</w:t>
-      </w:r>
-      <w:r>
-        <w:t>le project organization, invitations, collaboration, and a one-click UX mindset.</w:t>
+        <w:t>Built a low-friction task app around fast capture, simple project organization, invitations, collaboration, and a one-click UX mindset.</w:t>
       </w:r>
     </w:p>
     <w:p>
@@ -844,6 +697,7 @@
       <w:pPr>
         <w:spacing w:before="220" w:after="60"/>
       </w:pPr>
+      <w:bookmarkStart w:id="0" w:name="_GoBack"/>
       <w:r>
         <w:rPr>
           <w:b/>
@@ -856,6 +710,7 @@
         <w:t>EXPERIENCE</w:t>
       </w:r>
     </w:p>
+    <w:bookmarkEnd w:id="0"/>
     <w:p>
       <w:pPr>
         <w:pBdr>
@@ -891,12 +746,6 @@
         <w:gridCol w:w="3080"/>
       </w:tblGrid>
       <w:tr>
-        <w:tblPrEx>
-          <w:tblCellMar>
-            <w:top w:w="0" w:type="dxa"/>
-            <w:bottom w:w="0" w:type="dxa"/>
-          </w:tblCellMar>
-        </w:tblPrEx>
         <w:tc>
           <w:tcPr>
             <w:tcW w:w="7000" w:type="dxa"/>
@@ -1006,10 +855,7 @@
         <w:spacing w:before="40" w:after="40"/>
       </w:pPr>
       <w:r>
-        <w:t>Identified operational friction across inventory, sales, customers, fina</w:t>
-      </w:r>
-      <w:r>
-        <w:t>nce, suppliers, staff roles, and reporting — then designed software workflows around how the business actually worked.</w:t>
+        <w:t>Identified operational friction across inventory, sales, customers, finance, suppliers, staff roles, and reporting — then designed software workflows around how the business actually worked.</w:t>
       </w:r>
     </w:p>
     <w:p>
@@ -1022,10 +868,7 @@
         <w:spacing w:before="40" w:after="40"/>
       </w:pPr>
       <w:r>
-        <w:t>Built and iterated internal systems used in real daily operations, with a strong focus on usability, decision clarity, and reducing repea</w:t>
-      </w:r>
-      <w:r>
-        <w:t>ted manual work.</w:t>
+        <w:t>Built and iterated internal systems used in real daily operations, with a strong focus on usability, decision clarity, and reducing repeated manual work.</w:t>
       </w:r>
     </w:p>
     <w:p>
@@ -1060,12 +903,6 @@
         <w:gridCol w:w="3080"/>
       </w:tblGrid>
       <w:tr>
-        <w:tblPrEx>
-          <w:tblCellMar>
-            <w:top w:w="0" w:type="dxa"/>
-            <w:bottom w:w="0" w:type="dxa"/>
-          </w:tblCellMar>
-        </w:tblPrEx>
         <w:tc>
           <w:tcPr>
             <w:tcW w:w="7000" w:type="dxa"/>
@@ -1163,10 +1000,7 @@
         <w:spacing w:before="40" w:after="40"/>
       </w:pPr>
       <w:r>
-        <w:t>Worked across product thinking, UI/UX, frontend, backend/data structure, desktop pack</w:t>
-      </w:r>
-      <w:r>
-        <w:t>aging, and deployment.</w:t>
+        <w:t>Worked across product thinking, UI/UX, frontend, backend/data structure, desktop packaging, and deployment.</w:t>
       </w:r>
     </w:p>
     <w:p>
@@ -1238,12 +1072,6 @@
         <w:gridCol w:w="8080"/>
       </w:tblGrid>
       <w:tr>
-        <w:tblPrEx>
-          <w:tblCellMar>
-            <w:top w:w="0" w:type="dxa"/>
-            <w:bottom w:w="0" w:type="dxa"/>
-          </w:tblCellMar>
-        </w:tblPrEx>
         <w:tc>
           <w:tcPr>
             <w:tcW w:w="2000" w:type="dxa"/>
@@ -1322,12 +1150,6 @@
         <w:gridCol w:w="8080"/>
       </w:tblGrid>
       <w:tr>
-        <w:tblPrEx>
-          <w:tblCellMar>
-            <w:top w:w="0" w:type="dxa"/>
-            <w:bottom w:w="0" w:type="dxa"/>
-          </w:tblCellMar>
-        </w:tblPrEx>
         <w:tc>
           <w:tcPr>
             <w:tcW w:w="2000" w:type="dxa"/>
@@ -1438,12 +1260,6 @@
         <w:gridCol w:w="8080"/>
       </w:tblGrid>
       <w:tr>
-        <w:tblPrEx>
-          <w:tblCellMar>
-            <w:top w:w="0" w:type="dxa"/>
-            <w:bottom w:w="0" w:type="dxa"/>
-          </w:tblCellMar>
-        </w:tblPrEx>
         <w:tc>
           <w:tcPr>
             <w:tcW w:w="2000" w:type="dxa"/>
@@ -1497,7 +1313,13 @@
             </w:r>
             <w:proofErr w:type="spellEnd"/>
             <w:r>
-              <w:t>, PostgreSQL, MongoDB, Firebase, SQL/NoSQL, PHP, Django, Electron, local-first persistence</w:t>
+              <w:t>,</w:t>
+            </w:r>
+            <w:r>
+              <w:t xml:space="preserve"> Python, </w:t>
+            </w:r>
+            <w:r>
+              <w:t xml:space="preserve"> PostgreSQL, MongoDB, Firebase, SQL/NoSQL, PHP, Django, Electron, local-first persistence</w:t>
             </w:r>
           </w:p>
         </w:tc>
@@ -1530,12 +1352,6 @@
         <w:gridCol w:w="8080"/>
       </w:tblGrid>
       <w:tr>
-        <w:tblPrEx>
-          <w:tblCellMar>
-            <w:top w:w="0" w:type="dxa"/>
-            <w:bottom w:w="0" w:type="dxa"/>
-          </w:tblCellMar>
-        </w:tblPrEx>
         <w:tc>
           <w:tcPr>
             <w:tcW w:w="2000" w:type="dxa"/>
@@ -1581,10 +1397,7 @@
           </w:tcPr>
           <w:p>
             <w:r>
-              <w:t>Ph</w:t>
-            </w:r>
-            <w:r>
-              <w:t>otoshop, Illustrator, After Effects, Premiere Pro, Cursor, prompt architecture, AI-assisted development</w:t>
+              <w:t>Photoshop, Illustrator, After Effects, Premiere Pro, Cursor, prompt architecture, AI-assisted development</w:t>
             </w:r>
           </w:p>
         </w:tc>
@@ -1646,12 +1459,6 @@
         <w:gridCol w:w="3080"/>
       </w:tblGrid>
       <w:tr>
-        <w:tblPrEx>
-          <w:tblCellMar>
-            <w:top w:w="0" w:type="dxa"/>
-            <w:bottom w:w="0" w:type="dxa"/>
-          </w:tblCellMar>
-        </w:tblPrEx>
         <w:tc>
           <w:tcPr>
             <w:tcW w:w="7000" w:type="dxa"/>
@@ -1714,23 +1521,7 @@
                 <w:sz w:val="17"/>
                 <w:szCs w:val="17"/>
               </w:rPr>
-              <w:t xml:space="preserve"> </w:t>
-            </w:r>
-            <w:r>
-              <w:rPr>
-                <w:color w:val="9CA3AF"/>
-                <w:sz w:val="17"/>
-                <w:szCs w:val="17"/>
-              </w:rPr>
-              <w:t>·</w:t>
-            </w:r>
-            <w:r>
-              <w:rPr>
-                <w:color w:val="9CA3AF"/>
-                <w:sz w:val="17"/>
-                <w:szCs w:val="17"/>
-              </w:rPr>
-              <w:t xml:space="preserve"> GPA 3.7/4</w:t>
+              <w:t xml:space="preserve"> · GPA 3.7/4</w:t>
             </w:r>
             <w:r>
               <w:rPr>
@@ -1749,35 +1540,21 @@
         <w:spacing w:after="80"/>
       </w:pPr>
       <w:r>
-        <w:t xml:space="preserve">Nailed a place </w:t>
-      </w:r>
-      <w:r>
-        <w:t>in LIU’s President’s Honor List</w:t>
-      </w:r>
-      <w:r>
-        <w:t>- Fall 2023/2024</w:t>
+        <w:t>Nailed a place in LIU’s President’s Honor List- Fall 2023/2024</w:t>
       </w:r>
       <w:r>
         <w:br/>
-      </w:r>
-      <w:r>
         <w:t>Nailed a place in LIU’s Dean’s Honor List- Spring 2023/2024</w:t>
       </w:r>
       <w:r>
         <w:br/>
-      </w:r>
-      <w:r>
         <w:t>Nailed a place in LIU’s Dean’s Honor List- Spring 2022/2023</w:t>
       </w:r>
       <w:r>
         <w:br/>
-      </w:r>
-      <w:bookmarkStart w:id="0" w:name="_GoBack"/>
-      <w:r>
         <w:t>Nailed a place in LIU’s Dean’s Honor List- Fall 2022/2023</w:t>
       </w:r>
     </w:p>
-    <w:bookmarkEnd w:id="0"/>
     <w:p>
       <w:pPr>
         <w:spacing w:before="220" w:after="60"/>
@@ -1791,18 +1568,7 @@
           <w:sz w:val="20"/>
           <w:szCs w:val="20"/>
         </w:rPr>
-        <w:t>A</w:t>
-      </w:r>
-      <w:r>
-        <w:rPr>
-          <w:b/>
-          <w:bCs/>
-          <w:color w:val="1A2B4A"/>
-          <w:spacing w:val="80"/>
-          <w:sz w:val="20"/>
-          <w:szCs w:val="20"/>
-        </w:rPr>
-        <w:t>DDITIONAL BACKGROUND</w:t>
+        <w:t>ADDITIONAL BACKGROUND</w:t>
       </w:r>
     </w:p>
     <w:p>
@@ -1820,10 +1586,7 @@
     </w:p>
     <w:p>
       <w:r>
-        <w:t>Practical experience in customer-facing operations, workshop leadership, business analysis, production workflows, printing systems, and fabrication processes. Comfortable moving between business needs, interface design, and engineering execution. Strong pr</w:t>
-      </w:r>
-      <w:r>
-        <w:t>eference for building useful systems over decorative demos.</w:t>
+        <w:t>Practical experience in customer-facing operations, workshop leadership, business analysis, production workflows, printing systems, and fabrication processes. Comfortable moving between business needs, interface design, and engineering execution. Strong preference for building useful systems over decorative demos.</w:t>
       </w:r>
     </w:p>
     <w:sectPr>

</xml_diff>